<commit_message>
Update main header and buglist for OOP issue
</commit_message>
<xml_diff>
--- a/Project1/buglist.docx
+++ b/Project1/buglist.docx
@@ -12,8 +12,8 @@
         <w:gridCol w:w="804"/>
         <w:gridCol w:w="1891"/>
         <w:gridCol w:w="2160"/>
-        <w:gridCol w:w="2160"/>
-        <w:gridCol w:w="1615"/>
+        <w:gridCol w:w="1980"/>
+        <w:gridCol w:w="1795"/>
       </w:tblGrid>
       <w:tr>
         <w:tc>
@@ -50,19 +50,7 @@
               <w:rPr>
                 <w:rFonts w:ascii="Times New Roman" w:hAnsi="Times New Roman" w:cs="Times New Roman"/>
               </w:rPr>
-              <w:t xml:space="preserve">Description of Bug (be specific </w:t>
-            </w:r>
-            <w:r>
-              <w:rPr>
-                <w:rFonts w:ascii="Times New Roman" w:hAnsi="Times New Roman" w:cs="Times New Roman"/>
-              </w:rPr>
-              <w:t>a</w:t>
-            </w:r>
-            <w:r>
-              <w:rPr>
-                <w:rFonts w:ascii="Times New Roman" w:hAnsi="Times New Roman" w:cs="Times New Roman"/>
-              </w:rPr>
-              <w:t>bout what is not working)</w:t>
+              <w:t>Description of Bug (be specific about what is not working)</w:t>
             </w:r>
           </w:p>
         </w:tc>
@@ -81,19 +69,7 @@
               <w:rPr>
                 <w:rFonts w:ascii="Times New Roman" w:hAnsi="Times New Roman" w:cs="Times New Roman"/>
               </w:rPr>
-              <w:t>Location of Bug (file, class,</w:t>
-            </w:r>
-            <w:r>
-              <w:rPr>
-                <w:rFonts w:ascii="Times New Roman" w:hAnsi="Times New Roman" w:cs="Times New Roman"/>
-              </w:rPr>
-              <w:t xml:space="preserve"> </w:t>
-            </w:r>
-            <w:r>
-              <w:rPr>
-                <w:rFonts w:ascii="Times New Roman" w:hAnsi="Times New Roman" w:cs="Times New Roman"/>
-              </w:rPr>
-              <w:t xml:space="preserve">method, </w:t>
+              <w:t xml:space="preserve">Location of Bug (file, class, method, </w:t>
             </w:r>
             <w:proofErr w:type="spellStart"/>
             <w:r>
@@ -113,7 +89,7 @@
         </w:tc>
         <w:tc>
           <w:tcPr>
-            <w:tcW w:w="2160" w:type="dxa"/>
+            <w:tcW w:w="1980" w:type="dxa"/>
           </w:tcPr>
           <w:p>
             <w:pPr>
@@ -126,25 +102,13 @@
               <w:rPr>
                 <w:rFonts w:ascii="Times New Roman" w:hAnsi="Times New Roman" w:cs="Times New Roman"/>
               </w:rPr>
-              <w:t>Steps to Recreate Bug</w:t>
-            </w:r>
-            <w:r>
-              <w:rPr>
-                <w:rFonts w:ascii="Times New Roman" w:hAnsi="Times New Roman" w:cs="Times New Roman"/>
-              </w:rPr>
-              <w:t xml:space="preserve"> </w:t>
-            </w:r>
-            <w:r>
-              <w:rPr>
-                <w:rFonts w:ascii="Times New Roman" w:hAnsi="Times New Roman" w:cs="Times New Roman"/>
-              </w:rPr>
-              <w:t>and/or Test Case #</w:t>
+              <w:t>Steps to Recreate Bug and/or Test Case #</w:t>
             </w:r>
           </w:p>
         </w:tc>
         <w:tc>
           <w:tcPr>
-            <w:tcW w:w="1615" w:type="dxa"/>
+            <w:tcW w:w="1795" w:type="dxa"/>
           </w:tcPr>
           <w:p>
             <w:pPr>
@@ -174,6 +138,12 @@
                 <w:rFonts w:ascii="Times New Roman" w:hAnsi="Times New Roman" w:cs="Times New Roman"/>
               </w:rPr>
             </w:pPr>
+            <w:r>
+              <w:rPr>
+                <w:rFonts w:ascii="Times New Roman" w:hAnsi="Times New Roman" w:cs="Times New Roman"/>
+              </w:rPr>
+              <w:t>1</w:t>
+            </w:r>
           </w:p>
         </w:tc>
         <w:tc>
@@ -187,6 +157,36 @@
                 <w:rFonts w:ascii="Times New Roman" w:hAnsi="Times New Roman" w:cs="Times New Roman"/>
               </w:rPr>
             </w:pPr>
+            <w:r>
+              <w:rPr>
+                <w:rFonts w:ascii="Times New Roman" w:hAnsi="Times New Roman" w:cs="Times New Roman"/>
+              </w:rPr>
+              <w:t>Information collection</w:t>
+            </w:r>
+            <w:r>
+              <w:rPr>
+                <w:rFonts w:ascii="Times New Roman" w:hAnsi="Times New Roman" w:cs="Times New Roman"/>
+              </w:rPr>
+              <w:t xml:space="preserve">, such as open/read file and prompting </w:t>
+            </w:r>
+            <w:r>
+              <w:rPr>
+                <w:rFonts w:ascii="Times New Roman" w:hAnsi="Times New Roman" w:cs="Times New Roman"/>
+              </w:rPr>
+              <w:t xml:space="preserve">user </w:t>
+            </w:r>
+            <w:r>
+              <w:rPr>
+                <w:rFonts w:ascii="Times New Roman" w:hAnsi="Times New Roman" w:cs="Times New Roman"/>
+              </w:rPr>
+              <w:t>input, are</w:t>
+            </w:r>
+            <w:r>
+              <w:rPr>
+                <w:rFonts w:ascii="Times New Roman" w:hAnsi="Times New Roman" w:cs="Times New Roman"/>
+              </w:rPr>
+              <w:t xml:space="preserve"> in procedural rather than OOP.</w:t>
+            </w:r>
           </w:p>
         </w:tc>
         <w:tc>
@@ -200,11 +200,17 @@
                 <w:rFonts w:ascii="Times New Roman" w:hAnsi="Times New Roman" w:cs="Times New Roman"/>
               </w:rPr>
             </w:pPr>
+            <w:r>
+              <w:rPr>
+                <w:rFonts w:ascii="Times New Roman" w:hAnsi="Times New Roman" w:cs="Times New Roman"/>
+              </w:rPr>
+              <w:t>main.cpp</w:t>
+            </w:r>
           </w:p>
         </w:tc>
         <w:tc>
           <w:tcPr>
-            <w:tcW w:w="2160" w:type="dxa"/>
+            <w:tcW w:w="1980" w:type="dxa"/>
           </w:tcPr>
           <w:p>
             <w:pPr>
@@ -213,11 +219,17 @@
                 <w:rFonts w:ascii="Times New Roman" w:hAnsi="Times New Roman" w:cs="Times New Roman"/>
               </w:rPr>
             </w:pPr>
+            <w:r>
+              <w:rPr>
+                <w:rFonts w:ascii="Times New Roman" w:hAnsi="Times New Roman" w:cs="Times New Roman"/>
+              </w:rPr>
+              <w:t>None. Code exists in the main.cpp.</w:t>
+            </w:r>
           </w:p>
         </w:tc>
         <w:tc>
           <w:tcPr>
-            <w:tcW w:w="1615" w:type="dxa"/>
+            <w:tcW w:w="1795" w:type="dxa"/>
           </w:tcPr>
           <w:p>
             <w:pPr>
@@ -226,73 +238,12 @@
                 <w:rFonts w:ascii="Times New Roman" w:hAnsi="Times New Roman" w:cs="Times New Roman"/>
               </w:rPr>
             </w:pPr>
-          </w:p>
-        </w:tc>
-      </w:tr>
-      <w:tr>
-        <w:tc>
-          <w:tcPr>
-            <w:tcW w:w="804" w:type="dxa"/>
-          </w:tcPr>
-          <w:p>
-            <w:pPr>
-              <w:jc w:val="both"/>
-              <w:rPr>
-                <w:rFonts w:ascii="Times New Roman" w:hAnsi="Times New Roman" w:cs="Times New Roman"/>
-              </w:rPr>
-            </w:pPr>
-          </w:p>
-        </w:tc>
-        <w:tc>
-          <w:tcPr>
-            <w:tcW w:w="1891" w:type="dxa"/>
-          </w:tcPr>
-          <w:p>
-            <w:pPr>
-              <w:jc w:val="both"/>
-              <w:rPr>
-                <w:rFonts w:ascii="Times New Roman" w:hAnsi="Times New Roman" w:cs="Times New Roman"/>
-              </w:rPr>
-            </w:pPr>
-          </w:p>
-        </w:tc>
-        <w:tc>
-          <w:tcPr>
-            <w:tcW w:w="2160" w:type="dxa"/>
-          </w:tcPr>
-          <w:p>
-            <w:pPr>
-              <w:jc w:val="both"/>
-              <w:rPr>
-                <w:rFonts w:ascii="Times New Roman" w:hAnsi="Times New Roman" w:cs="Times New Roman"/>
-              </w:rPr>
-            </w:pPr>
-          </w:p>
-        </w:tc>
-        <w:tc>
-          <w:tcPr>
-            <w:tcW w:w="2160" w:type="dxa"/>
-          </w:tcPr>
-          <w:p>
-            <w:pPr>
-              <w:jc w:val="both"/>
-              <w:rPr>
-                <w:rFonts w:ascii="Times New Roman" w:hAnsi="Times New Roman" w:cs="Times New Roman"/>
-              </w:rPr>
-            </w:pPr>
-          </w:p>
-        </w:tc>
-        <w:tc>
-          <w:tcPr>
-            <w:tcW w:w="1615" w:type="dxa"/>
-          </w:tcPr>
-          <w:p>
-            <w:pPr>
-              <w:jc w:val="both"/>
-              <w:rPr>
-                <w:rFonts w:ascii="Times New Roman" w:hAnsi="Times New Roman" w:cs="Times New Roman"/>
-              </w:rPr>
-            </w:pPr>
+            <w:r>
+              <w:rPr>
+                <w:rFonts w:ascii="Times New Roman" w:hAnsi="Times New Roman" w:cs="Times New Roman"/>
+              </w:rPr>
+              <w:t>Not considering and coding all parts of the system in OOP.</w:t>
+            </w:r>
           </w:p>
         </w:tc>
       </w:tr>

</xml_diff>

<commit_message>
Update comment for assumption, main.cpp, and buglist
</commit_message>
<xml_diff>
--- a/Project1/buglist.docx
+++ b/Project1/buglist.docx
@@ -69,21 +69,7 @@
               <w:rPr>
                 <w:rFonts w:ascii="Times New Roman" w:hAnsi="Times New Roman" w:cs="Times New Roman"/>
               </w:rPr>
-              <w:t xml:space="preserve">Location of Bug (file, class, method, </w:t>
-            </w:r>
-            <w:proofErr w:type="spellStart"/>
-            <w:r>
-              <w:rPr>
-                <w:rFonts w:ascii="Times New Roman" w:hAnsi="Times New Roman" w:cs="Times New Roman"/>
-              </w:rPr>
-              <w:t>etc</w:t>
-            </w:r>
-            <w:proofErr w:type="spellEnd"/>
-            <w:r>
-              <w:rPr>
-                <w:rFonts w:ascii="Times New Roman" w:hAnsi="Times New Roman" w:cs="Times New Roman"/>
-              </w:rPr>
-              <w:t>)</w:t>
+              <w:t>Location of Bug (file, class, method, etc)</w:t>
             </w:r>
           </w:p>
         </w:tc>
@@ -242,7 +228,43 @@
               <w:rPr>
                 <w:rFonts w:ascii="Times New Roman" w:hAnsi="Times New Roman" w:cs="Times New Roman"/>
               </w:rPr>
-              <w:t>Not considering and coding all parts of the system in OOP.</w:t>
+              <w:t>This</w:t>
+            </w:r>
+            <w:r>
+              <w:rPr>
+                <w:rFonts w:ascii="Times New Roman" w:hAnsi="Times New Roman" w:cs="Times New Roman"/>
+              </w:rPr>
+              <w:t xml:space="preserve"> part</w:t>
+            </w:r>
+            <w:r>
+              <w:rPr>
+                <w:rFonts w:ascii="Times New Roman" w:hAnsi="Times New Roman" w:cs="Times New Roman"/>
+              </w:rPr>
+              <w:t xml:space="preserve"> of the system </w:t>
+            </w:r>
+            <w:r>
+              <w:rPr>
+                <w:rFonts w:ascii="Times New Roman" w:hAnsi="Times New Roman" w:cs="Times New Roman"/>
+              </w:rPr>
+              <w:t xml:space="preserve">is not designed by following the </w:t>
+            </w:r>
+            <w:r>
+              <w:rPr>
+                <w:rFonts w:ascii="Times New Roman" w:hAnsi="Times New Roman" w:cs="Times New Roman"/>
+              </w:rPr>
+              <w:t>OOP</w:t>
+            </w:r>
+            <w:r>
+              <w:rPr>
+                <w:rFonts w:ascii="Times New Roman" w:hAnsi="Times New Roman" w:cs="Times New Roman"/>
+              </w:rPr>
+              <w:t xml:space="preserve"> principle</w:t>
+            </w:r>
+            <w:r>
+              <w:rPr>
+                <w:rFonts w:ascii="Times New Roman" w:hAnsi="Times New Roman" w:cs="Times New Roman"/>
+              </w:rPr>
+              <w:t>.</w:t>
             </w:r>
           </w:p>
         </w:tc>

</xml_diff>